<commit_message>
Refresh portfolio copy, expandable experience, and resume.
Bring the live site in line with NAT-22: hero and role text, more/less experience details, Conversational AI & Evals, chat disclaimer footer, and the updated resume file.

Co-authored-by: Cursor <cursoragent@cursor.com>
</commit_message>
<xml_diff>
--- a/assets/Nathan Hamilton Resume Product Manager.docx
+++ b/assets/Nathan Hamilton Resume Product Manager.docx
@@ -142,44 +142,125 @@
             <w:vertAlign w:val="baseline"/>
             <w:rtl w:val="0"/>
           </w:rPr>
-          <w:t xml:space="preserve">Assess My Fit With AI</w:t>
+          <w:t xml:space="preserve">AI R</w:t>
         </w:r>
       </w:hyperlink>
-      <w:r>
-        <w:rPr>
-          <w:rtl w:val="0"/>
-        </w:rPr>
-      </w:r>
-    </w:p>
-    <w:p>
-      <w:pPr>
-        <w:spacing w:before="120" w:lineRule="auto"/>
-        <w:rPr>
-          <w:i w:val="0"/>
-          <w:iCs w:val="0"/>
-          <w:smallCaps w:val="0"/>
-          <w:strike w:val="0"/>
+      <w:hyperlink r:id="rId8">
+        <w:r>
+          <w:rPr>
+            <w:color w:val="2a7b89"/>
+            <w:sz w:val="24"/>
+            <w:szCs w:val="24"/>
+            <w:u w:val="single"/>
+            <w:rtl w:val="0"/>
+          </w:rPr>
+          <w:t xml:space="preserve">ole Fit Assessor</w:t>
+        </w:r>
+      </w:hyperlink>
+      <w:r>
+        <w:rPr>
+          <w:rtl w:val="0"/>
+        </w:rPr>
+      </w:r>
+    </w:p>
+    <w:p>
+      <w:pPr>
+        <w:pStyle w:val="Heading2"/>
+        <w:spacing w:before="0" w:lineRule="auto"/>
+        <w:rPr>
+          <w:color w:val="000000"/>
+          <w:sz w:val="24"/>
+          <w:szCs w:val="24"/>
+        </w:rPr>
+      </w:pPr>
+      <w:bookmarkStart w:colFirst="0" w:colLast="0" w:name="_pmvmgviyzfeh" w:id="0"/>
+      <w:bookmarkEnd w:id="0"/>
+      <w:r>
+        <w:rPr>
+          <w:smallCaps w:val="0"/>
+          <w:color w:val="000000"/>
+          <w:rtl w:val="0"/>
+        </w:rPr>
+        <w:t xml:space="preserve">9-figure product creator, acquisition to exit as a founder, with GM range in between</w:t>
+      </w:r>
+      <w:r>
+        <w:rPr>
+          <w:rtl w:val="0"/>
+        </w:rPr>
+      </w:r>
+    </w:p>
+    <w:p>
+      <w:pPr>
+        <w:numPr>
+          <w:ilvl w:val="0"/>
+          <w:numId w:val="1"/>
+        </w:numPr>
+        <w:spacing w:after="0" w:afterAutospacing="0" w:before="120" w:lineRule="auto"/>
+        <w:ind w:left="360" w:hanging="360"/>
+        <w:rPr>
+          <w:color w:val="000000"/>
+          <w:sz w:val="24"/>
+          <w:szCs w:val="24"/>
+        </w:rPr>
+      </w:pPr>
+      <w:r>
+        <w:rPr>
+          <w:color w:val="000000"/>
+          <w:sz w:val="24"/>
+          <w:szCs w:val="24"/>
+          <w:rtl w:val="0"/>
+        </w:rPr>
+        <w:t xml:space="preserve">Incubated a 0-to-1 fintech product that scaled to $100M revenue, leading the product vision with P&amp;L ownership, resulting in a xx% increase in the enterprise valuation.</w:t>
+      </w:r>
+    </w:p>
+    <w:p>
+      <w:pPr>
+        <w:numPr>
+          <w:ilvl w:val="0"/>
+          <w:numId w:val="3"/>
+        </w:numPr>
+        <w:spacing w:after="0" w:afterAutospacing="0" w:before="0" w:beforeAutospacing="0" w:lineRule="auto"/>
+        <w:ind w:left="360" w:hanging="360"/>
+        <w:rPr>
           <w:color w:val="000000"/>
           <w:sz w:val="24"/>
           <w:szCs w:val="24"/>
           <w:u w:val="none"/>
-          <w:shd w:fill="auto" w:val="clear"/>
-          <w:vertAlign w:val="baseline"/>
-        </w:rPr>
-      </w:pPr>
-      <w:r>
-        <w:rPr>
-          <w:color w:val="000000"/>
-          <w:sz w:val="24"/>
-          <w:szCs w:val="24"/>
-          <w:rtl w:val="0"/>
-        </w:rPr>
-        <w:t xml:space="preserve">Senior product leader with founder range. Created a 0-to-1 B2C product that scaled to $100M revenue, leading the product vision with P&amp;L ownership. Acquired an investing SaaS as a founder, executing a product-led turnaround to improve trust, activation, retention, and monetization (119% LTV increase, 11% to 5% churn, 28% to 73% trial conversion) in under a year. Equally comfortable with 0-to-1 vision, 1-to-100 scale, shipping AI in regulated spaces, and the full-stack product work in between.</w:t>
-      </w:r>
-      <w:r>
-        <w:rPr>
-          <w:rtl w:val="0"/>
-        </w:rPr>
+        </w:rPr>
+      </w:pPr>
+      <w:r>
+        <w:rPr>
+          <w:color w:val="000000"/>
+          <w:sz w:val="24"/>
+          <w:szCs w:val="24"/>
+          <w:rtl w:val="0"/>
+        </w:rPr>
+        <w:t xml:space="preserve">Acquired an investing analytics SaaS as a founder, executing a product-led turnaround to improve trust, activation, retention, and monetization (+119% LTV, 11% to 5% churn, 28% to 73% trial conversion) in under a year. </w:t>
+      </w:r>
+    </w:p>
+    <w:p>
+      <w:pPr>
+        <w:numPr>
+          <w:ilvl w:val="0"/>
+          <w:numId w:val="3"/>
+        </w:numPr>
+        <w:spacing w:before="0" w:beforeAutospacing="0" w:lineRule="auto"/>
+        <w:ind w:left="360" w:hanging="360"/>
+        <w:rPr>
+          <w:color w:val="000000"/>
+          <w:sz w:val="24"/>
+          <w:szCs w:val="24"/>
+          <w:u w:val="none"/>
+        </w:rPr>
+      </w:pPr>
+      <w:r>
+        <w:rPr>
+          <w:color w:val="000000"/>
+          <w:sz w:val="24"/>
+          <w:szCs w:val="24"/>
+          <w:rtl w:val="0"/>
+        </w:rPr>
+        <w:t xml:space="preserve">Equally comfortable with 0-to-1 vision, 1-to-100 scale, shipping AI in regulated spaces, and the full-stack product work in between.</w:t>
       </w:r>
     </w:p>
     <w:p>
@@ -190,6 +271,234 @@
         </w:pBdr>
         <w:rPr/>
       </w:pPr>
+      <w:bookmarkStart w:colFirst="0" w:colLast="0" w:name="_ncs9sem2xrzk" w:id="1"/>
+      <w:bookmarkEnd w:id="1"/>
+      <w:r>
+        <w:rPr>
+          <w:rtl w:val="0"/>
+        </w:rPr>
+        <w:t xml:space="preserve">EXPLORATORY PROJECTS</w:t>
+      </w:r>
+    </w:p>
+    <w:p>
+      <w:pPr>
+        <w:spacing w:after="0" w:lineRule="auto"/>
+        <w:rPr>
+          <w:smallCaps w:val="0"/>
+          <w:color w:val="000000"/>
+          <w:sz w:val="24"/>
+          <w:szCs w:val="24"/>
+        </w:rPr>
+      </w:pPr>
+      <w:r>
+        <w:rPr>
+          <w:b w:val="1"/>
+          <w:bCs w:val="1"/>
+          <w:color w:val="000000"/>
+          <w:sz w:val="24"/>
+          <w:szCs w:val="24"/>
+          <w:rtl w:val="0"/>
+        </w:rPr>
+        <w:t xml:space="preserve">Conversational AI &amp; evals </w:t>
+      </w:r>
+      <w:r>
+        <w:rPr>
+          <w:color w:val="000000"/>
+          <w:sz w:val="24"/>
+          <w:szCs w:val="24"/>
+          <w:rtl w:val="0"/>
+        </w:rPr>
+        <w:t xml:space="preserve">– </w:t>
+      </w:r>
+      <w:r>
+        <w:rPr>
+          <w:smallCaps w:val="0"/>
+          <w:color w:val="000000"/>
+          <w:sz w:val="24"/>
+          <w:szCs w:val="24"/>
+          <w:rtl w:val="0"/>
+        </w:rPr>
+        <w:t xml:space="preserve">Built a</w:t>
+      </w:r>
+      <w:r>
+        <w:rPr>
+          <w:color w:val="000000"/>
+          <w:sz w:val="24"/>
+          <w:szCs w:val="24"/>
+          <w:rtl w:val="0"/>
+        </w:rPr>
+        <w:t xml:space="preserve"> personal finance</w:t>
+      </w:r>
+      <w:r>
+        <w:rPr>
+          <w:smallCaps w:val="0"/>
+          <w:color w:val="000000"/>
+          <w:sz w:val="24"/>
+          <w:szCs w:val="24"/>
+          <w:rtl w:val="0"/>
+        </w:rPr>
+        <w:t xml:space="preserve"> AI cop</w:t>
+      </w:r>
+      <w:r>
+        <w:rPr>
+          <w:color w:val="000000"/>
+          <w:sz w:val="24"/>
+          <w:szCs w:val="24"/>
+          <w:rtl w:val="0"/>
+        </w:rPr>
+        <w:t xml:space="preserve">ilot</w:t>
+      </w:r>
+      <w:r>
+        <w:rPr>
+          <w:smallCaps w:val="0"/>
+          <w:color w:val="000000"/>
+          <w:sz w:val="24"/>
+          <w:szCs w:val="24"/>
+          <w:rtl w:val="0"/>
+        </w:rPr>
+        <w:t xml:space="preserve">, plus an eval and observability infrastructure to compare LLM models on accuracy, policy/red-team refusals, estimated cost, and latency. (</w:t>
+      </w:r>
+      <w:hyperlink r:id="rId9">
+        <w:r>
+          <w:rPr>
+            <w:smallCaps w:val="0"/>
+            <w:color w:val="1155cc"/>
+            <w:sz w:val="24"/>
+            <w:szCs w:val="24"/>
+            <w:u w:val="single"/>
+            <w:rtl w:val="0"/>
+          </w:rPr>
+          <w:t xml:space="preserve">Github</w:t>
+        </w:r>
+      </w:hyperlink>
+      <w:r>
+        <w:rPr>
+          <w:smallCaps w:val="0"/>
+          <w:color w:val="000000"/>
+          <w:sz w:val="24"/>
+          <w:szCs w:val="24"/>
+          <w:rtl w:val="0"/>
+        </w:rPr>
+        <w:t xml:space="preserve">, </w:t>
+      </w:r>
+      <w:hyperlink r:id="rId10">
+        <w:r>
+          <w:rPr>
+            <w:smallCaps w:val="0"/>
+            <w:color w:val="1155cc"/>
+            <w:sz w:val="24"/>
+            <w:szCs w:val="24"/>
+            <w:u w:val="single"/>
+            <w:rtl w:val="0"/>
+          </w:rPr>
+          <w:t xml:space="preserve">App</w:t>
+        </w:r>
+      </w:hyperlink>
+      <w:r>
+        <w:rPr>
+          <w:smallCaps w:val="0"/>
+          <w:color w:val="000000"/>
+          <w:sz w:val="24"/>
+          <w:szCs w:val="24"/>
+          <w:rtl w:val="0"/>
+        </w:rPr>
+        <w:t xml:space="preserve">)</w:t>
+      </w:r>
+    </w:p>
+    <w:p>
+      <w:pPr>
+        <w:spacing w:after="0" w:lineRule="auto"/>
+        <w:rPr>
+          <w:sz w:val="24"/>
+          <w:szCs w:val="24"/>
+        </w:rPr>
+      </w:pPr>
+      <w:r>
+        <w:rPr>
+          <w:b w:val="1"/>
+          <w:bCs w:val="1"/>
+          <w:color w:val="000000"/>
+          <w:sz w:val="24"/>
+          <w:szCs w:val="24"/>
+          <w:rtl w:val="0"/>
+        </w:rPr>
+        <w:t xml:space="preserve">Habit formation golf analytics app</w:t>
+      </w:r>
+      <w:r>
+        <w:rPr>
+          <w:color w:val="000000"/>
+          <w:sz w:val="24"/>
+          <w:szCs w:val="24"/>
+          <w:rtl w:val="0"/>
+        </w:rPr>
+        <w:t xml:space="preserve"> – </w:t>
+      </w:r>
+      <w:r>
+        <w:rPr>
+          <w:smallCaps w:val="0"/>
+          <w:color w:val="000000"/>
+          <w:sz w:val="24"/>
+          <w:szCs w:val="24"/>
+          <w:rtl w:val="0"/>
+        </w:rPr>
+        <w:t xml:space="preserve">Built an iOS/WatchOS conversational AI coaching and analytics app that analyzes golfer shot data, improves habits, and provides personalized </w:t>
+      </w:r>
+      <w:r>
+        <w:rPr>
+          <w:color w:val="000000"/>
+          <w:sz w:val="24"/>
+          <w:szCs w:val="24"/>
+          <w:rtl w:val="0"/>
+        </w:rPr>
+        <w:t xml:space="preserve">insights</w:t>
+      </w:r>
+      <w:r>
+        <w:rPr>
+          <w:smallCaps w:val="0"/>
+          <w:color w:val="000000"/>
+          <w:sz w:val="24"/>
+          <w:szCs w:val="24"/>
+          <w:rtl w:val="0"/>
+        </w:rPr>
+        <w:t xml:space="preserve"> for lowering scores. (</w:t>
+      </w:r>
+      <w:hyperlink r:id="rId11">
+        <w:r>
+          <w:rPr>
+            <w:smallCaps w:val="0"/>
+            <w:color w:val="1155cc"/>
+            <w:sz w:val="24"/>
+            <w:szCs w:val="24"/>
+            <w:u w:val="single"/>
+            <w:rtl w:val="0"/>
+          </w:rPr>
+          <w:t xml:space="preserve">Github</w:t>
+        </w:r>
+      </w:hyperlink>
+      <w:r>
+        <w:rPr>
+          <w:smallCaps w:val="0"/>
+          <w:color w:val="000000"/>
+          <w:sz w:val="24"/>
+          <w:szCs w:val="24"/>
+          <w:rtl w:val="0"/>
+        </w:rPr>
+        <w:t xml:space="preserve">)</w:t>
+      </w:r>
+      <w:r>
+        <w:rPr>
+          <w:rtl w:val="0"/>
+        </w:rPr>
+      </w:r>
+    </w:p>
+    <w:p>
+      <w:pPr>
+        <w:pStyle w:val="Heading1"/>
+        <w:pBdr>
+          <w:bottom w:color="2a7b89" w:space="1" w:sz="4" w:val="single"/>
+        </w:pBdr>
+        <w:rPr/>
+      </w:pPr>
       <w:r>
         <w:rPr>
           <w:rtl w:val="0"/>
@@ -259,7 +568,7 @@
           <w:rtl w:val="0"/>
         </w:rPr>
         <w:tab/>
-        <w:t xml:space="preserve">                              2022 - 2026</w:t>
+        <w:t xml:space="preserve">                               2022 - 2026</w:t>
       </w:r>
     </w:p>
     <w:p>
@@ -277,15 +586,7 @@
           <w:color w:val="000000"/>
           <w:rtl w:val="0"/>
         </w:rPr>
-        <w:t xml:space="preserve">Lifecycle p</w:t>
-      </w:r>
-      <w:r>
-        <w:rPr>
-          <w:smallCaps w:val="0"/>
-          <w:color w:val="000000"/>
-          <w:rtl w:val="0"/>
-        </w:rPr>
-        <w:t xml:space="preserve">roduct leadership, product-led growth</w:t>
+        <w:t xml:space="preserve">Lifecycle product leadership, product-led growth (activation, retention, pricing)</w:t>
       </w:r>
     </w:p>
     <w:p>
@@ -310,7 +611,6 @@
         <w:ind w:left="360" w:right="0" w:hanging="360"/>
         <w:jc w:val="left"/>
         <w:rPr>
-          <w:rFonts w:ascii="Cambria" w:cs="Cambria" w:eastAsia="Cambria" w:hAnsi="Cambria"/>
           <w:i w:val="0"/>
           <w:iCs w:val="0"/>
           <w:smallCaps w:val="0"/>
@@ -332,86 +632,15 @@
           <w:sz w:val="24"/>
           <w:szCs w:val="24"/>
           <w:u w:val="none"/>
-          <w:shd w:fill="auto" w:val="clear"/>
           <w:vertAlign w:val="baseline"/>
           <w:rtl w:val="0"/>
         </w:rPr>
-        <w:t xml:space="preserve">Acquired a</w:t>
-      </w:r>
-      <w:r>
-        <w:rPr>
-          <w:color w:val="000000"/>
-          <w:sz w:val="24"/>
-          <w:szCs w:val="24"/>
-          <w:rtl w:val="0"/>
-        </w:rPr>
-        <w:t xml:space="preserve">n </w:t>
-      </w:r>
-      <w:r>
-        <w:rPr>
-          <w:i w:val="0"/>
-          <w:iCs w:val="0"/>
-          <w:smallCaps w:val="0"/>
-          <w:strike w:val="0"/>
-          <w:color w:val="000000"/>
-          <w:sz w:val="24"/>
-          <w:szCs w:val="24"/>
-          <w:u w:val="none"/>
-          <w:shd w:fill="auto" w:val="clear"/>
-          <w:vertAlign w:val="baseline"/>
-          <w:rtl w:val="0"/>
-        </w:rPr>
-        <w:t xml:space="preserve">investing SaaS with a 1-star rating that drifted from its ICP</w:t>
-      </w:r>
-      <w:r>
-        <w:rPr>
-          <w:color w:val="000000"/>
-          <w:sz w:val="24"/>
-          <w:szCs w:val="24"/>
-          <w:rtl w:val="0"/>
-        </w:rPr>
-        <w:t xml:space="preserve">.</w:t>
-      </w:r>
-      <w:r>
-        <w:rPr>
-          <w:i w:val="0"/>
-          <w:iCs w:val="0"/>
-          <w:smallCaps w:val="0"/>
-          <w:strike w:val="0"/>
-          <w:color w:val="000000"/>
-          <w:sz w:val="24"/>
-          <w:szCs w:val="24"/>
-          <w:u w:val="none"/>
-          <w:shd w:fill="auto" w:val="clear"/>
-          <w:vertAlign w:val="baseline"/>
-          <w:rtl w:val="0"/>
-        </w:rPr>
-        <w:t xml:space="preserve"> Took full P&amp;L ownership and refocused the product around the core user — now consistently rated 5 stars </w:t>
-      </w:r>
-      <w:r>
-        <w:rPr>
-          <w:color w:val="000000"/>
-          <w:sz w:val="24"/>
-          <w:szCs w:val="24"/>
-          <w:rtl w:val="0"/>
-        </w:rPr>
-        <w:t xml:space="preserve">with</w:t>
-      </w:r>
-      <w:r>
-        <w:rPr>
-          <w:i w:val="0"/>
-          <w:iCs w:val="0"/>
-          <w:smallCaps w:val="0"/>
-          <w:strike w:val="0"/>
-          <w:color w:val="000000"/>
-          <w:sz w:val="24"/>
-          <w:szCs w:val="24"/>
-          <w:u w:val="none"/>
-          <w:shd w:fill="auto" w:val="clear"/>
-          <w:vertAlign w:val="baseline"/>
-          <w:rtl w:val="0"/>
-        </w:rPr>
-        <w:t xml:space="preserve"> 39,000 users.</w:t>
+        <w:t xml:space="preserve">Acquired an investing SaaS with a 1-star rating that drifted from its ICP. Took full P&amp;L ownership and refocused the product around the core user — now consistently rated 5 stars with 39,000 users.</w:t>
+      </w:r>
+      <w:r>
+        <w:rPr>
+          <w:rtl w:val="0"/>
+        </w:rPr>
       </w:r>
     </w:p>
     <w:p>
@@ -436,7 +665,6 @@
         <w:ind w:left="360" w:right="0" w:hanging="360"/>
         <w:jc w:val="left"/>
         <w:rPr>
-          <w:rFonts w:ascii="Cambria" w:cs="Cambria" w:eastAsia="Cambria" w:hAnsi="Cambria"/>
           <w:i w:val="0"/>
           <w:iCs w:val="0"/>
           <w:smallCaps w:val="0"/>
@@ -513,6 +741,11 @@
           <w:rtl w:val="0"/>
         </w:rPr>
         <w:t xml:space="preserve">and market research.</w:t>
+      </w:r>
+      <w:r>
+        <w:rPr>
+          <w:rtl w:val="0"/>
+        </w:rPr>
       </w:r>
     </w:p>
     <w:p>
@@ -537,7 +770,6 @@
         <w:ind w:left="360" w:right="0" w:hanging="360"/>
         <w:jc w:val="left"/>
         <w:rPr>
-          <w:rFonts w:ascii="Cambria" w:cs="Cambria" w:eastAsia="Cambria" w:hAnsi="Cambria"/>
           <w:i w:val="0"/>
           <w:iCs w:val="0"/>
           <w:smallCaps w:val="0"/>
@@ -597,7 +829,12 @@
           <w:vertAlign w:val="baseline"/>
           <w:rtl w:val="0"/>
         </w:rPr>
-        <w:t xml:space="preserve"> roadmap spanning 3 stakeholder groups, delivering an 18-month turnaround in under 12 months — 50% faster than forecasted.</w:t>
+        <w:t xml:space="preserve"> roadmap spanning 3 stakeholder groups, delivering an 18-month turnaround in under 12 months — 50% faster than forecasted and leading to a profitable exit.</w:t>
+      </w:r>
+      <w:r>
+        <w:rPr>
+          <w:rtl w:val="0"/>
+        </w:rPr>
       </w:r>
     </w:p>
     <w:p>
@@ -609,7 +846,6 @@
         <w:spacing w:after="0" w:lineRule="auto"/>
         <w:ind w:left="360" w:hanging="360"/>
         <w:rPr>
-          <w:rFonts w:ascii="Cambria" w:cs="Cambria" w:eastAsia="Cambria" w:hAnsi="Cambria"/>
           <w:color w:val="000000"/>
           <w:sz w:val="24"/>
           <w:szCs w:val="24"/>
@@ -623,6 +859,11 @@
           <w:rtl w:val="0"/>
         </w:rPr>
         <w:t xml:space="preserve">Increased trial conversion from 28% to 73% diagnosing pain points and drop offs through user surveys, analytics, and UX audits. Rebuilt onboarding flows around TTV and product reliability.</w:t>
+      </w:r>
+      <w:r>
+        <w:rPr>
+          <w:rtl w:val="0"/>
+        </w:rPr>
       </w:r>
     </w:p>
     <w:p>
@@ -634,7 +875,6 @@
         <w:spacing w:after="0" w:lineRule="auto"/>
         <w:ind w:left="360" w:hanging="360"/>
         <w:rPr>
-          <w:rFonts w:ascii="Cambria" w:cs="Cambria" w:eastAsia="Cambria" w:hAnsi="Cambria"/>
           <w:color w:val="000000"/>
           <w:sz w:val="24"/>
           <w:szCs w:val="24"/>
@@ -648,6 +888,11 @@
           <w:rtl w:val="0"/>
         </w:rPr>
         <w:t xml:space="preserve">Identified key 0 to 90-day retention levers and reduced churn from 11% to 5% partnering with engineering to prioritize data accuracy, API reliability, and user-requested feature updates.</w:t>
+      </w:r>
+      <w:r>
+        <w:rPr>
+          <w:rtl w:val="0"/>
+        </w:rPr>
       </w:r>
     </w:p>
     <w:p>
@@ -659,7 +904,6 @@
         <w:spacing w:after="0" w:lineRule="auto"/>
         <w:ind w:left="360" w:hanging="360"/>
         <w:rPr>
-          <w:rFonts w:ascii="Cambria" w:cs="Cambria" w:eastAsia="Cambria" w:hAnsi="Cambria"/>
           <w:color w:val="000000"/>
           <w:sz w:val="24"/>
           <w:szCs w:val="24"/>
@@ -673,6 +917,11 @@
           <w:rtl w:val="0"/>
         </w:rPr>
         <w:t xml:space="preserve">Identified pricing and feature portfolio opportunities, sequencing Pro tier feature releases and simplifying pricing to raise annual plan adoption from 40% to 85%, driving 119% LTV growth.</w:t>
+      </w:r>
+      <w:r>
+        <w:rPr>
+          <w:rtl w:val="0"/>
+        </w:rPr>
       </w:r>
     </w:p>
     <w:p>
@@ -699,15 +948,15 @@
           <w:color w:val="000000"/>
         </w:rPr>
       </w:pPr>
-      <w:bookmarkStart w:colFirst="0" w:colLast="0" w:name="_fflr7og81vo6" w:id="0"/>
-      <w:bookmarkEnd w:id="0"/>
-      <w:r>
-        <w:rPr>
-          <w:smallCaps w:val="0"/>
-          <w:color w:val="000000"/>
-          <w:rtl w:val="0"/>
-        </w:rPr>
-        <w:t xml:space="preserve">Conversational AI, other shipped AI</w:t>
+      <w:bookmarkStart w:colFirst="0" w:colLast="0" w:name="_z78tr0sjo82r" w:id="2"/>
+      <w:bookmarkEnd w:id="2"/>
+      <w:r>
+        <w:rPr>
+          <w:smallCaps w:val="0"/>
+          <w:color w:val="000000"/>
+          <w:rtl w:val="0"/>
+        </w:rPr>
+        <w:t xml:space="preserve">Shipped AI (conversational AI, evals &amp; observability, AI engineering)</w:t>
       </w:r>
     </w:p>
     <w:p>
@@ -719,20 +968,24 @@
         <w:spacing w:after="0" w:lineRule="auto"/>
         <w:ind w:left="360" w:hanging="360"/>
         <w:rPr>
-          <w:rFonts w:ascii="Cambria" w:cs="Cambria" w:eastAsia="Cambria" w:hAnsi="Cambria"/>
-          <w:color w:val="000000"/>
-          <w:sz w:val="24"/>
-          <w:szCs w:val="24"/>
-        </w:rPr>
-      </w:pPr>
-      <w:r>
-        <w:rPr>
-          <w:color w:val="000000"/>
-          <w:sz w:val="24"/>
-          <w:szCs w:val="24"/>
-          <w:rtl w:val="0"/>
-        </w:rPr>
-        <w:t xml:space="preserve">Owned end-to-end product lifecycle for a Claude Haiku-powered dividend investing chatbot, including system prompt engineering, guardrail design for regulatory compliance, and direct API integration.</w:t>
+          <w:color w:val="000000"/>
+          <w:sz w:val="24"/>
+          <w:szCs w:val="24"/>
+        </w:rPr>
+      </w:pPr>
+      <w:r>
+        <w:rPr>
+          <w:color w:val="000000"/>
+          <w:sz w:val="24"/>
+          <w:szCs w:val="24"/>
+          <w:rtl w:val="0"/>
+        </w:rPr>
+        <w:t xml:space="preserve">Owned product lifecycle for a Claude-powered dividend investing copilot, including system prompt engineering, guardrail design for regulatory compliance, evals strategy, and direct API integration.</w:t>
+      </w:r>
+      <w:r>
+        <w:rPr>
+          <w:rtl w:val="0"/>
+        </w:rPr>
       </w:r>
     </w:p>
     <w:p>
@@ -744,7 +997,6 @@
         <w:spacing w:after="0" w:lineRule="auto"/>
         <w:ind w:left="360" w:hanging="360"/>
         <w:rPr>
-          <w:rFonts w:ascii="Cambria" w:cs="Cambria" w:eastAsia="Cambria" w:hAnsi="Cambria"/>
           <w:color w:val="000000"/>
           <w:sz w:val="24"/>
           <w:szCs w:val="24"/>
@@ -758,6 +1010,11 @@
           <w:rtl w:val="0"/>
         </w:rPr>
         <w:t xml:space="preserve">Owned product lifecycle for AI-powered PDF portfolio import feature, using LLM document extraction to compress TTV to 2 minutes (80% improvement). Ran model training and golden dataset evals.</w:t>
+      </w:r>
+      <w:r>
+        <w:rPr>
+          <w:rtl w:val="0"/>
+        </w:rPr>
       </w:r>
     </w:p>
     <w:p>
@@ -768,7 +1025,6 @@
         </w:numPr>
         <w:ind w:left="360" w:hanging="360"/>
         <w:rPr>
-          <w:rFonts w:ascii="Cambria" w:cs="Cambria" w:eastAsia="Cambria" w:hAnsi="Cambria"/>
           <w:color w:val="000000"/>
           <w:sz w:val="24"/>
           <w:szCs w:val="24"/>
@@ -782,6 +1038,11 @@
           <w:rtl w:val="0"/>
         </w:rPr>
         <w:t xml:space="preserve">Accelerated engineering velocity shipping 15+ lifecycle product updates leveraging AI-assisted engineering workflows (Cursor, Claude Code, Figma).</w:t>
+      </w:r>
+      <w:r>
+        <w:rPr>
+          <w:rtl w:val="0"/>
+        </w:rPr>
       </w:r>
     </w:p>
     <w:p>
@@ -816,7 +1077,7 @@
           <w:color w:val="000000"/>
           <w:rtl w:val="0"/>
         </w:rPr>
-        <w:t xml:space="preserve">Vice President, Product &amp; Growth                                    </w:t>
+        <w:t xml:space="preserve">Director, Product &amp; Growth                                    </w:t>
       </w:r>
       <w:r>
         <w:rPr>
@@ -831,7 +1092,7 @@
         <w:tab/>
         <w:t xml:space="preserve">             </w:t>
         <w:tab/>
-        <w:t xml:space="preserve">                 2015 – 2022</w:t>
+        <w:t xml:space="preserve">                               2015 – 2022</w:t>
       </w:r>
       <w:r>
         <w:rPr>
@@ -854,7 +1115,7 @@
           <w:color w:val="000000"/>
           <w:rtl w:val="0"/>
         </w:rPr>
-        <w:t xml:space="preserve">0-to-1 product, growth marketing, cross-functional org leadership</w:t>
+        <w:t xml:space="preserve">0-to-1 product leadership</w:t>
       </w:r>
     </w:p>
     <w:p>
@@ -882,9 +1143,17 @@
           <w:color w:val="000000"/>
           <w:sz w:val="24"/>
           <w:szCs w:val="24"/>
-          <w:u w:val="none"/>
-        </w:rPr>
-      </w:pPr>
+        </w:rPr>
+      </w:pPr>
+      <w:r>
+        <w:rPr>
+          <w:color w:val="000000"/>
+          <w:sz w:val="24"/>
+          <w:szCs w:val="24"/>
+          <w:rtl w:val="0"/>
+        </w:rPr>
+        <w:t xml:space="preserve">Incubated</w:t>
+      </w:r>
       <w:r>
         <w:rPr>
           <w:i w:val="0"/>
@@ -899,7 +1168,7 @@
           <w:vertAlign w:val="baseline"/>
           <w:rtl w:val="0"/>
         </w:rPr>
-        <w:t xml:space="preserve">Created a 0</w:t>
+        <w:t xml:space="preserve"> a 0</w:t>
       </w:r>
       <w:r>
         <w:rPr>
@@ -949,7 +1218,12 @@
           <w:vertAlign w:val="baseline"/>
           <w:rtl w:val="0"/>
         </w:rPr>
-        <w:t xml:space="preserve">1 consumer finance product that scaled to $100M+ annual revenue and a ~35-person organization by helping users make confident, trusted money decisions.</w:t>
+        <w:t xml:space="preserve">1 consumer finance product that scaled to $100M revenue and a ~35-person organization by helping users make confident, trusted money decisions.</w:t>
+      </w:r>
+      <w:r>
+        <w:rPr>
+          <w:rtl w:val="0"/>
+        </w:rPr>
       </w:r>
     </w:p>
     <w:p>
@@ -981,11 +1255,35 @@
           <w:color w:val="000000"/>
           <w:sz w:val="24"/>
           <w:szCs w:val="24"/>
+          <w:shd w:fill="auto" w:val="clear"/>
+          <w:vertAlign w:val="baseline"/>
+        </w:rPr>
+      </w:pPr>
+      <w:r>
+        <w:rPr>
+          <w:i w:val="0"/>
+          <w:iCs w:val="0"/>
+          <w:smallCaps w:val="0"/>
+          <w:strike w:val="0"/>
+          <w:color w:val="000000"/>
+          <w:sz w:val="24"/>
+          <w:szCs w:val="24"/>
           <w:u w:val="none"/>
           <w:shd w:fill="auto" w:val="clear"/>
           <w:vertAlign w:val="baseline"/>
-        </w:rPr>
-      </w:pPr>
+          <w:rtl w:val="0"/>
+        </w:rPr>
+        <w:t xml:space="preserve">Secured $5M internal seed investment using a 50,000-respondent user research survey to sequence credit and banking as launch verticals, shape core UX, and build the momentum that won CEO and cross-functional buy-in on the product vision and to reprioritize resources </w:t>
+      </w:r>
+      <w:r>
+        <w:rPr>
+          <w:color w:val="000000"/>
+          <w:sz w:val="24"/>
+          <w:szCs w:val="24"/>
+          <w:rtl w:val="0"/>
+        </w:rPr>
+        <w:t xml:space="preserve">toward</w:t>
+      </w:r>
       <w:r>
         <w:rPr>
           <w:i w:val="0"/>
@@ -1000,7 +1298,12 @@
           <w:vertAlign w:val="baseline"/>
           <w:rtl w:val="0"/>
         </w:rPr>
-        <w:t xml:space="preserve">Used a 50,000-respondent user survey to drive two early product decisions — launching credit and banking verticals first based on demand signals and shaping core UX based on user information gaps.</w:t>
+        <w:t xml:space="preserve"> the MVP.</w:t>
+      </w:r>
+      <w:r>
+        <w:rPr>
+          <w:rtl w:val="0"/>
+        </w:rPr>
       </w:r>
     </w:p>
     <w:p>
@@ -1032,26 +1335,25 @@
           <w:color w:val="000000"/>
           <w:sz w:val="24"/>
           <w:szCs w:val="24"/>
+          <w:shd w:fill="auto" w:val="clear"/>
+          <w:vertAlign w:val="baseline"/>
+        </w:rPr>
+      </w:pPr>
+      <w:r>
+        <w:rPr>
+          <w:i w:val="0"/>
+          <w:iCs w:val="0"/>
+          <w:smallCaps w:val="0"/>
+          <w:strike w:val="0"/>
+          <w:color w:val="000000"/>
+          <w:sz w:val="24"/>
+          <w:szCs w:val="24"/>
           <w:u w:val="none"/>
           <w:shd w:fill="auto" w:val="clear"/>
           <w:vertAlign w:val="baseline"/>
-        </w:rPr>
-      </w:pPr>
-      <w:r>
-        <w:rPr>
-          <w:i w:val="0"/>
-          <w:iCs w:val="0"/>
-          <w:smallCaps w:val="0"/>
-          <w:strike w:val="0"/>
-          <w:color w:val="000000"/>
-          <w:sz w:val="24"/>
-          <w:szCs w:val="24"/>
-          <w:u w:val="none"/>
-          <w:shd w:fill="auto" w:val="clear"/>
-          <w:vertAlign w:val="baseline"/>
-          <w:rtl w:val="0"/>
-        </w:rPr>
-        <w:t xml:space="preserve">Secured $5M internal seed investment by driving CEO buy-in on product vision and negotiating with cross-functional leaders to reprioritize resources toward the MVP.</w:t>
+          <w:rtl w:val="0"/>
+        </w:rPr>
+        <w:t xml:space="preserve">Owned the product roadmap across 6 product verticals (credit cards, banking, mortgage, investing, insurance, personal loans), aligning 7 cross-functional teams behind a shared product vision.</w:t>
       </w:r>
     </w:p>
     <w:p>
@@ -1076,6 +1378,13 @@
         <w:ind w:left="360" w:right="0" w:hanging="360"/>
         <w:jc w:val="left"/>
         <w:rPr>
+          <w:color w:val="000000"/>
+          <w:sz w:val="24"/>
+          <w:szCs w:val="24"/>
+        </w:rPr>
+      </w:pPr>
+      <w:r>
+        <w:rPr>
           <w:i w:val="0"/>
           <w:iCs w:val="0"/>
           <w:smallCaps w:val="0"/>
@@ -1086,23 +1395,18 @@
           <w:u w:val="none"/>
           <w:shd w:fill="auto" w:val="clear"/>
           <w:vertAlign w:val="baseline"/>
-        </w:rPr>
-      </w:pPr>
-      <w:r>
-        <w:rPr>
-          <w:i w:val="0"/>
-          <w:iCs w:val="0"/>
-          <w:smallCaps w:val="0"/>
-          <w:strike w:val="0"/>
-          <w:color w:val="000000"/>
-          <w:sz w:val="24"/>
-          <w:szCs w:val="24"/>
-          <w:u w:val="none"/>
-          <w:shd w:fill="auto" w:val="clear"/>
-          <w:vertAlign w:val="baseline"/>
-          <w:rtl w:val="0"/>
-        </w:rPr>
-        <w:t xml:space="preserve">Owned the product roadmap across 6 product verticals (credit cards, banking, mortgage, investing, insurance, personal loans), aligning 7 cross-functional teams behind a shared product vision.</w:t>
+          <w:rtl w:val="0"/>
+        </w:rPr>
+        <w:t xml:space="preserve">Led product rationalization of two absorbed business lines, recommending sunset of ~$6M annual revenue based on ICP misalignment</w:t>
+      </w:r>
+      <w:r>
+        <w:rPr>
+          <w:color w:val="000000"/>
+          <w:sz w:val="24"/>
+          <w:szCs w:val="24"/>
+          <w:rtl w:val="0"/>
+        </w:rPr>
+        <w:t xml:space="preserve">.</w:t>
       </w:r>
     </w:p>
     <w:p>
@@ -1111,10 +1415,6 @@
         <w:keepLines w:val="0"/>
         <w:pageBreakBefore w:val="0"/>
         <w:widowControl w:val="1"/>
-        <w:numPr>
-          <w:ilvl w:val="0"/>
-          <w:numId w:val="2"/>
-        </w:numPr>
         <w:pBdr>
           <w:top w:space="0" w:sz="0" w:val="nil"/>
           <w:left w:space="0" w:sz="0" w:val="nil"/>
@@ -1124,209 +1424,206 @@
         </w:pBdr>
         <w:shd w:fill="auto" w:val="clear"/>
         <w:spacing w:after="0" w:before="0" w:line="240" w:lineRule="auto"/>
-        <w:ind w:left="360" w:right="0" w:hanging="360"/>
+        <w:ind w:left="0" w:right="0" w:firstLine="0"/>
         <w:jc w:val="left"/>
         <w:rPr>
-          <w:i w:val="0"/>
-          <w:iCs w:val="0"/>
-          <w:smallCaps w:val="0"/>
-          <w:strike w:val="0"/>
-          <w:color w:val="000000"/>
-          <w:sz w:val="24"/>
-          <w:szCs w:val="24"/>
-          <w:u w:val="none"/>
-          <w:shd w:fill="auto" w:val="clear"/>
-          <w:vertAlign w:val="baseline"/>
-        </w:rPr>
-      </w:pPr>
-      <w:r>
-        <w:rPr>
-          <w:i w:val="0"/>
-          <w:iCs w:val="0"/>
-          <w:smallCaps w:val="0"/>
-          <w:strike w:val="0"/>
-          <w:color w:val="000000"/>
-          <w:sz w:val="24"/>
-          <w:szCs w:val="24"/>
-          <w:u w:val="none"/>
-          <w:shd w:fill="auto" w:val="clear"/>
-          <w:vertAlign w:val="baseline"/>
-          <w:rtl w:val="0"/>
-        </w:rPr>
-        <w:t xml:space="preserve">Optimized post-launch UX through behavioral analysis, usability interviews, and A/B testing, focused on information hierarchy and TTV, targeting 20%+ lift per experiment.</w:t>
-      </w:r>
-      <w:r>
-        <w:rPr>
-          <w:rtl w:val="0"/>
-        </w:rPr>
-      </w:r>
-    </w:p>
-    <w:p>
-      <w:pPr>
-        <w:keepNext w:val="0"/>
-        <w:keepLines w:val="0"/>
-        <w:pageBreakBefore w:val="0"/>
-        <w:widowControl w:val="1"/>
+          <w:color w:val="000000"/>
+          <w:sz w:val="24"/>
+          <w:szCs w:val="24"/>
+        </w:rPr>
+      </w:pPr>
+      <w:r>
+        <w:rPr>
+          <w:rtl w:val="0"/>
+        </w:rPr>
+      </w:r>
+    </w:p>
+    <w:p>
+      <w:pPr>
+        <w:pStyle w:val="Heading2"/>
+        <w:spacing w:before="0" w:lineRule="auto"/>
+        <w:rPr>
+          <w:color w:val="000000"/>
+          <w:sz w:val="24"/>
+          <w:szCs w:val="24"/>
+        </w:rPr>
+      </w:pPr>
+      <w:bookmarkStart w:colFirst="0" w:colLast="0" w:name="_zgiw2efu3vi0" w:id="3"/>
+      <w:bookmarkEnd w:id="3"/>
+      <w:r>
+        <w:rPr>
+          <w:smallCaps w:val="0"/>
+          <w:color w:val="000000"/>
+          <w:rtl w:val="0"/>
+        </w:rPr>
+        <w:t xml:space="preserve">GTM, organic acquisition, experimentation</w:t>
+      </w:r>
+      <w:r>
+        <w:rPr>
+          <w:rtl w:val="0"/>
+        </w:rPr>
+      </w:r>
+    </w:p>
+    <w:p>
+      <w:pPr>
         <w:numPr>
           <w:ilvl w:val="0"/>
           <w:numId w:val="2"/>
         </w:numPr>
-        <w:pBdr>
-          <w:top w:space="0" w:sz="0" w:val="nil"/>
-          <w:left w:space="0" w:sz="0" w:val="nil"/>
-          <w:bottom w:space="0" w:sz="0" w:val="nil"/>
-          <w:right w:space="0" w:sz="0" w:val="nil"/>
-          <w:between w:space="0" w:sz="0" w:val="nil"/>
-        </w:pBdr>
-        <w:shd w:fill="auto" w:val="clear"/>
-        <w:spacing w:after="0" w:before="0" w:line="240" w:lineRule="auto"/>
-        <w:ind w:left="360" w:right="0" w:hanging="360"/>
-        <w:jc w:val="left"/>
-        <w:rPr>
-          <w:color w:val="000000"/>
-          <w:sz w:val="24"/>
-          <w:szCs w:val="24"/>
-          <w:u w:val="none"/>
-        </w:rPr>
-      </w:pPr>
-      <w:r>
-        <w:rPr>
-          <w:i w:val="0"/>
-          <w:iCs w:val="0"/>
-          <w:smallCaps w:val="0"/>
-          <w:strike w:val="0"/>
-          <w:color w:val="000000"/>
-          <w:sz w:val="24"/>
-          <w:szCs w:val="24"/>
-          <w:u w:val="none"/>
-          <w:shd w:fill="auto" w:val="clear"/>
-          <w:vertAlign w:val="baseline"/>
-          <w:rtl w:val="0"/>
-        </w:rPr>
-        <w:t xml:space="preserve">Led product rationalization of two absorbed business lines, recommending sunset of ~$6M annual revenue based on ICP misalignment</w:t>
-      </w:r>
-      <w:r>
-        <w:rPr>
-          <w:color w:val="000000"/>
-          <w:sz w:val="24"/>
-          <w:szCs w:val="24"/>
-          <w:rtl w:val="0"/>
-        </w:rPr>
-        <w:t xml:space="preserve">.</w:t>
-      </w:r>
-    </w:p>
-    <w:p>
-      <w:pPr>
-        <w:keepNext w:val="0"/>
-        <w:keepLines w:val="0"/>
-        <w:pageBreakBefore w:val="0"/>
-        <w:widowControl w:val="1"/>
+        <w:spacing w:after="0" w:lineRule="auto"/>
+        <w:ind w:left="360" w:hanging="360"/>
+        <w:rPr>
+          <w:color w:val="000000"/>
+          <w:sz w:val="24"/>
+          <w:szCs w:val="24"/>
+        </w:rPr>
+      </w:pPr>
+      <w:r>
+        <w:rPr>
+          <w:color w:val="000000"/>
+          <w:sz w:val="24"/>
+          <w:szCs w:val="24"/>
+          <w:rtl w:val="0"/>
+        </w:rPr>
+        <w:t xml:space="preserve">Built the SEO function from zero. Conceived the strategy and led team through 1-to-100 stage to 5M MAUs and $7.2M revenue, capturing #1 rankings in high-competition personal finance categories.</w:t>
+      </w:r>
+    </w:p>
+    <w:p>
+      <w:pPr>
         <w:numPr>
           <w:ilvl w:val="0"/>
           <w:numId w:val="2"/>
         </w:numPr>
-        <w:pBdr>
-          <w:top w:space="0" w:sz="0" w:val="nil"/>
-          <w:left w:space="0" w:sz="0" w:val="nil"/>
-          <w:bottom w:space="0" w:sz="0" w:val="nil"/>
-          <w:right w:space="0" w:sz="0" w:val="nil"/>
-          <w:between w:space="0" w:sz="0" w:val="nil"/>
-        </w:pBdr>
-        <w:shd w:fill="auto" w:val="clear"/>
-        <w:spacing w:after="0" w:before="0" w:line="240" w:lineRule="auto"/>
-        <w:ind w:left="360" w:right="0" w:hanging="360"/>
-        <w:jc w:val="left"/>
-        <w:rPr>
-          <w:color w:val="000000"/>
-          <w:sz w:val="24"/>
-          <w:szCs w:val="24"/>
-          <w:u w:val="none"/>
-        </w:rPr>
-      </w:pPr>
-      <w:r>
-        <w:rPr>
-          <w:color w:val="000000"/>
-          <w:sz w:val="24"/>
-          <w:szCs w:val="24"/>
-          <w:rtl w:val="0"/>
-        </w:rPr>
-        <w:t xml:space="preserve">Built the SEO function from zero. Conceived the strategy and led team through 1-to-100 stage to 5M MAUs and $7.2M revenue, capturing #1 rankings in high-competition personal finance categories.</w:t>
-      </w:r>
-    </w:p>
-    <w:p>
-      <w:pPr>
-        <w:keepNext w:val="0"/>
-        <w:keepLines w:val="0"/>
-        <w:pageBreakBefore w:val="0"/>
-        <w:widowControl w:val="1"/>
+        <w:spacing w:after="0" w:lineRule="auto"/>
+        <w:ind w:left="360" w:hanging="360"/>
+        <w:rPr>
+          <w:color w:val="000000"/>
+          <w:sz w:val="24"/>
+          <w:szCs w:val="24"/>
+        </w:rPr>
+      </w:pPr>
+      <w:r>
+        <w:rPr>
+          <w:color w:val="000000"/>
+          <w:sz w:val="24"/>
+          <w:szCs w:val="24"/>
+          <w:rtl w:val="0"/>
+        </w:rPr>
+        <w:t xml:space="preserve">Launched 8+ paid acquisition channels (email, display, PPC, social), scaling to a $50M+ annual budget. Owned lifecycle funnel performance and the platform infrastructure that powered it, including a custom CMS, reporting systems, attribution modeling, and A/B testing infrastructure.</w:t>
+      </w:r>
+    </w:p>
+    <w:p>
+      <w:pPr>
         <w:numPr>
           <w:ilvl w:val="0"/>
           <w:numId w:val="2"/>
         </w:numPr>
-        <w:pBdr>
-          <w:top w:space="0" w:sz="0" w:val="nil"/>
-          <w:left w:space="0" w:sz="0" w:val="nil"/>
-          <w:bottom w:space="0" w:sz="0" w:val="nil"/>
-          <w:right w:space="0" w:sz="0" w:val="nil"/>
-          <w:between w:space="0" w:sz="0" w:val="nil"/>
-        </w:pBdr>
-        <w:shd w:fill="auto" w:val="clear"/>
-        <w:spacing w:after="0" w:afterAutospacing="0" w:before="0" w:line="240" w:lineRule="auto"/>
-        <w:ind w:left="360" w:right="0" w:hanging="360"/>
-        <w:jc w:val="left"/>
-        <w:rPr>
-          <w:color w:val="000000"/>
-          <w:sz w:val="24"/>
-          <w:szCs w:val="24"/>
-          <w:u w:val="none"/>
-        </w:rPr>
-      </w:pPr>
-      <w:r>
-        <w:rPr>
-          <w:color w:val="000000"/>
-          <w:sz w:val="24"/>
-          <w:szCs w:val="24"/>
-          <w:rtl w:val="0"/>
-        </w:rPr>
-        <w:t xml:space="preserve">Launched 8+ paid acquisition channels (email, display, PPC, social), scaling to a $50M+ annual budget. Owned lifecycle funnel performance and the platform infrastructure that powered it, including a custom CMS, reporting systems, attribution modeling, and A/B testing infrastructure.</w:t>
-      </w:r>
-    </w:p>
-    <w:p>
-      <w:pPr>
-        <w:keepNext w:val="0"/>
-        <w:keepLines w:val="0"/>
-        <w:pageBreakBefore w:val="0"/>
-        <w:widowControl w:val="1"/>
+        <w:spacing w:after="0" w:lineRule="auto"/>
+        <w:ind w:left="360" w:hanging="360"/>
+        <w:rPr>
+          <w:color w:val="000000"/>
+          <w:sz w:val="24"/>
+          <w:szCs w:val="24"/>
+        </w:rPr>
+      </w:pPr>
+      <w:r>
+        <w:rPr>
+          <w:color w:val="000000"/>
+          <w:sz w:val="24"/>
+          <w:szCs w:val="24"/>
+          <w:rtl w:val="0"/>
+        </w:rPr>
+        <w:t xml:space="preserve">Optimized post-launch UX through behavioral analysis, usability interviews, and A/B testing, focused on information hierarchy and TTV, targeting 20%+ lift per experiment.</w:t>
+      </w:r>
+    </w:p>
+    <w:p>
+      <w:pPr>
+        <w:spacing w:after="0" w:lineRule="auto"/>
+        <w:ind w:left="720" w:firstLine="0"/>
+        <w:rPr>
+          <w:color w:val="000000"/>
+          <w:sz w:val="24"/>
+          <w:szCs w:val="24"/>
+        </w:rPr>
+      </w:pPr>
+      <w:r>
+        <w:rPr>
+          <w:rtl w:val="0"/>
+        </w:rPr>
+      </w:r>
+    </w:p>
+    <w:p>
+      <w:pPr>
+        <w:pStyle w:val="Heading2"/>
+        <w:spacing w:before="0" w:lineRule="auto"/>
+        <w:rPr>
+          <w:color w:val="000000"/>
+          <w:sz w:val="24"/>
+          <w:szCs w:val="24"/>
+        </w:rPr>
+      </w:pPr>
+      <w:bookmarkStart w:colFirst="0" w:colLast="0" w:name="_vcprt1tsvbf6" w:id="4"/>
+      <w:bookmarkEnd w:id="4"/>
+      <w:r>
+        <w:rPr>
+          <w:smallCaps w:val="0"/>
+          <w:color w:val="000000"/>
+          <w:rtl w:val="0"/>
+        </w:rPr>
+        <w:t xml:space="preserve">Team leadership, cross-functional orchestration/influence</w:t>
+      </w:r>
+      <w:r>
+        <w:rPr>
+          <w:rtl w:val="0"/>
+        </w:rPr>
+      </w:r>
+    </w:p>
+    <w:p>
+      <w:pPr>
         <w:numPr>
           <w:ilvl w:val="0"/>
           <w:numId w:val="2"/>
         </w:numPr>
-        <w:pBdr>
-          <w:top w:space="0" w:sz="0" w:val="nil"/>
-          <w:left w:space="0" w:sz="0" w:val="nil"/>
-          <w:bottom w:space="0" w:sz="0" w:val="nil"/>
-          <w:right w:space="0" w:sz="0" w:val="nil"/>
-          <w:between w:space="0" w:sz="0" w:val="nil"/>
-        </w:pBdr>
-        <w:shd w:fill="auto" w:val="clear"/>
-        <w:spacing w:after="240" w:before="0" w:line="240" w:lineRule="auto"/>
-        <w:ind w:left="360" w:right="0" w:hanging="360"/>
-        <w:jc w:val="left"/>
-        <w:rPr>
-          <w:color w:val="000000"/>
-          <w:sz w:val="24"/>
-          <w:szCs w:val="24"/>
-          <w:u w:val="none"/>
-        </w:rPr>
-      </w:pPr>
-      <w:r>
-        <w:rPr>
-          <w:color w:val="000000"/>
-          <w:sz w:val="24"/>
-          <w:szCs w:val="24"/>
-          <w:rtl w:val="0"/>
-        </w:rPr>
-        <w:t xml:space="preserve">Recruited and built a team of 20 (3 product leads, 6 growth strategists, 1 compliance lead, 10 contractors). Targeted coaching accelerated 3 team members from IC to people-management roles.</w:t>
+        <w:spacing w:after="0" w:lineRule="auto"/>
+        <w:ind w:left="360" w:hanging="360"/>
+        <w:rPr>
+          <w:color w:val="000000"/>
+          <w:sz w:val="24"/>
+          <w:szCs w:val="24"/>
+        </w:rPr>
+      </w:pPr>
+      <w:r>
+        <w:rPr>
+          <w:color w:val="000000"/>
+          <w:sz w:val="24"/>
+          <w:szCs w:val="24"/>
+          <w:rtl w:val="0"/>
+        </w:rPr>
+        <w:t xml:space="preserve">Recruited and built a 20-person team (3 product leads, 6 GTM strategists, 1 compliance lead, 10 contractors), directing cross-functional partnership with engineering, data science, and design to drive alignment and velocity behind product vision.</w:t>
+      </w:r>
+    </w:p>
+    <w:p>
+      <w:pPr>
+        <w:numPr>
+          <w:ilvl w:val="0"/>
+          <w:numId w:val="2"/>
+        </w:numPr>
+        <w:spacing w:after="0" w:lineRule="auto"/>
+        <w:ind w:left="360" w:hanging="360"/>
+        <w:rPr>
+          <w:color w:val="000000"/>
+          <w:sz w:val="24"/>
+          <w:szCs w:val="24"/>
+        </w:rPr>
+      </w:pPr>
+      <w:r>
+        <w:rPr>
+          <w:color w:val="000000"/>
+          <w:sz w:val="24"/>
+          <w:szCs w:val="24"/>
+          <w:rtl w:val="0"/>
+        </w:rPr>
+        <w:t xml:space="preserve">Targeted coaching accelerated 3 direct reports from IC to people-management roles in less than 12 months.</w:t>
       </w:r>
     </w:p>
     <w:p>
@@ -1337,8 +1634,8 @@
         </w:pBdr>
         <w:rPr/>
       </w:pPr>
-      <w:bookmarkStart w:colFirst="0" w:colLast="0" w:name="_9qn80uaaxv51" w:id="1"/>
-      <w:bookmarkEnd w:id="1"/>
+      <w:bookmarkStart w:colFirst="0" w:colLast="0" w:name="_x8h1yu9we3ya" w:id="5"/>
+      <w:bookmarkEnd w:id="5"/>
       <w:r>
         <w:rPr>
           <w:rtl w:val="0"/>
@@ -1359,8 +1656,8 @@
           <w:color w:val="000000"/>
         </w:rPr>
       </w:pPr>
-      <w:bookmarkStart w:colFirst="0" w:colLast="0" w:name="_eju12gvelq1s" w:id="2"/>
-      <w:bookmarkEnd w:id="2"/>
+      <w:bookmarkStart w:colFirst="0" w:colLast="0" w:name="_bzpwe43xphwa" w:id="6"/>
+      <w:bookmarkEnd w:id="6"/>
       <w:r>
         <w:rPr>
           <w:b w:val="0"/>
@@ -1380,7 +1677,7 @@
           <w:color w:val="000000"/>
           <w:rtl w:val="0"/>
         </w:rPr>
-        <w:t xml:space="preserve">Director, International Growth Marketing (2015), Performance Marketing Manager (2014 - 2015), Editorial Lead (2014)</w:t>
+        <w:t xml:space="preserve">Director, International Growth Marketing (2015), Growth Marketing Manager (2014 - 2015), Editorial Lead (2014)</w:t>
       </w:r>
     </w:p>
     <w:p>
@@ -1439,7 +1736,7 @@
           <w:bCs w:val="0"/>
           <w:rtl w:val="0"/>
         </w:rPr>
-        <w:t xml:space="preserve">SMITHSONIAN – </w:t>
+        <w:t xml:space="preserve">SMITHSONIAN ENDOWMENT – </w:t>
       </w:r>
       <w:r>
         <w:rPr>
@@ -1475,6 +1772,26 @@
         <w:pStyle w:val="Heading2"/>
         <w:spacing w:after="0" w:lineRule="auto"/>
         <w:jc w:val="both"/>
+        <w:rPr/>
+      </w:pPr>
+      <w:r>
+        <w:rPr>
+          <w:b w:val="0"/>
+          <w:bCs w:val="0"/>
+          <w:rtl w:val="0"/>
+        </w:rPr>
+        <w:t xml:space="preserve">CHARLES SCHWAB</w:t>
+      </w:r>
+      <w:r>
+        <w:rPr>
+          <w:b w:val="0"/>
+          <w:bCs w:val="0"/>
+          <w:color w:val="000000"/>
+          <w:rtl w:val="0"/>
+        </w:rPr>
+        <w:t xml:space="preserve"> – </w:t>
+      </w:r>
+      <w:r>
         <w:rPr>
           <w:b w:val="0"/>
           <w:bCs w:val="0"/>
@@ -1482,36 +1799,9 @@
           <w:iCs w:val="1"/>
           <w:smallCaps w:val="0"/>
           <w:color w:val="000000"/>
-        </w:rPr>
-      </w:pPr>
-      <w:r>
-        <w:rPr>
-          <w:b w:val="0"/>
-          <w:bCs w:val="0"/>
-          <w:rtl w:val="0"/>
-        </w:rPr>
-        <w:t xml:space="preserve">CHARLES SCHWAB</w:t>
-      </w:r>
-      <w:r>
-        <w:rPr>
-          <w:b w:val="0"/>
-          <w:bCs w:val="0"/>
-          <w:color w:val="000000"/>
-          <w:rtl w:val="0"/>
-        </w:rPr>
-        <w:t xml:space="preserve"> – </w:t>
-      </w:r>
-      <w:r>
-        <w:rPr>
-          <w:b w:val="0"/>
-          <w:bCs w:val="0"/>
-          <w:i w:val="1"/>
-          <w:iCs w:val="1"/>
-          <w:smallCaps w:val="0"/>
-          <w:color w:val="000000"/>
-          <w:rtl w:val="0"/>
-        </w:rPr>
-        <w:t xml:space="preserve">Senior Specialist, Equities and Options</w:t>
+          <w:rtl w:val="0"/>
+        </w:rPr>
+        <w:t xml:space="preserve">Senior Specialist, Equities and Options Trading</w:t>
       </w:r>
       <w:r>
         <w:rPr>
@@ -1605,21 +1895,7 @@
           <w:szCs w:val="24"/>
           <w:rtl w:val="0"/>
         </w:rPr>
-        <w:t xml:space="preserve">Roadmap &amp; P&amp;L ownership | 0→1 product creation | Product-led growth (PLG) | Product discovery &amp; validation | User &amp; market research | SEO | Metrics &amp; KPI ownership | Acquisition, onboarding, activation &amp; retention | Experimentation &amp; A/B testing | Executive communication &amp; influence | Technical product management | AI product &amp; engineering workflows | Cross-functional leadership | UX | UI | Design</w:t>
-      </w:r>
-    </w:p>
-    <w:p>
-      <w:pPr>
-        <w:rPr>
-          <w:color w:val="000000"/>
-          <w:sz w:val="24"/>
-          <w:szCs w:val="24"/>
-        </w:rPr>
-      </w:pPr>
-      <w:r>
-        <w:rPr>
-          <w:rtl w:val="0"/>
-        </w:rPr>
+        <w:t xml:space="preserve">Roadmap &amp; P&amp;L ownership | 0-to-1 product | Product-led growth (PLG) | Product discovery &amp; validation | User &amp; market research | SEO | Metrics &amp; KPI ownership | Acquisition, onboarding, activation &amp; retention | Experimentation &amp; A/B testing | Executive communication &amp; influence | AI product &amp; engineering workflows | Cross-functional leadership | UX | UI | Design | LLM model evals &amp; observability</w:t>
       </w:r>
     </w:p>
     <w:sectPr>
@@ -1854,11 +2130,124 @@
       </w:rPr>
     </w:lvl>
   </w:abstractNum>
+  <w:abstractNum w:abstractNumId="3">
+    <w:lvl w:ilvl="0">
+      <w:start w:val="1"/>
+      <w:numFmt w:val="bullet"/>
+      <w:lvlText w:val="●"/>
+      <w:lvlJc w:val="left"/>
+      <w:pPr>
+        <w:ind w:left="720" w:hanging="360"/>
+      </w:pPr>
+      <w:rPr>
+        <w:u w:val="none"/>
+      </w:rPr>
+    </w:lvl>
+    <w:lvl w:ilvl="1">
+      <w:start w:val="1"/>
+      <w:numFmt w:val="bullet"/>
+      <w:lvlText w:val="○"/>
+      <w:lvlJc w:val="left"/>
+      <w:pPr>
+        <w:ind w:left="1440" w:hanging="360"/>
+      </w:pPr>
+      <w:rPr>
+        <w:u w:val="none"/>
+      </w:rPr>
+    </w:lvl>
+    <w:lvl w:ilvl="2">
+      <w:start w:val="1"/>
+      <w:numFmt w:val="bullet"/>
+      <w:lvlText w:val="■"/>
+      <w:lvlJc w:val="left"/>
+      <w:pPr>
+        <w:ind w:left="2160" w:hanging="360"/>
+      </w:pPr>
+      <w:rPr>
+        <w:u w:val="none"/>
+      </w:rPr>
+    </w:lvl>
+    <w:lvl w:ilvl="3">
+      <w:start w:val="1"/>
+      <w:numFmt w:val="bullet"/>
+      <w:lvlText w:val="●"/>
+      <w:lvlJc w:val="left"/>
+      <w:pPr>
+        <w:ind w:left="2880" w:hanging="360"/>
+      </w:pPr>
+      <w:rPr>
+        <w:u w:val="none"/>
+      </w:rPr>
+    </w:lvl>
+    <w:lvl w:ilvl="4">
+      <w:start w:val="1"/>
+      <w:numFmt w:val="bullet"/>
+      <w:lvlText w:val="○"/>
+      <w:lvlJc w:val="left"/>
+      <w:pPr>
+        <w:ind w:left="3600" w:hanging="360"/>
+      </w:pPr>
+      <w:rPr>
+        <w:u w:val="none"/>
+      </w:rPr>
+    </w:lvl>
+    <w:lvl w:ilvl="5">
+      <w:start w:val="1"/>
+      <w:numFmt w:val="bullet"/>
+      <w:lvlText w:val="■"/>
+      <w:lvlJc w:val="left"/>
+      <w:pPr>
+        <w:ind w:left="4320" w:hanging="360"/>
+      </w:pPr>
+      <w:rPr>
+        <w:u w:val="none"/>
+      </w:rPr>
+    </w:lvl>
+    <w:lvl w:ilvl="6">
+      <w:start w:val="1"/>
+      <w:numFmt w:val="bullet"/>
+      <w:lvlText w:val="●"/>
+      <w:lvlJc w:val="left"/>
+      <w:pPr>
+        <w:ind w:left="5040" w:hanging="360"/>
+      </w:pPr>
+      <w:rPr>
+        <w:u w:val="none"/>
+      </w:rPr>
+    </w:lvl>
+    <w:lvl w:ilvl="7">
+      <w:start w:val="1"/>
+      <w:numFmt w:val="bullet"/>
+      <w:lvlText w:val="○"/>
+      <w:lvlJc w:val="left"/>
+      <w:pPr>
+        <w:ind w:left="5760" w:hanging="360"/>
+      </w:pPr>
+      <w:rPr>
+        <w:u w:val="none"/>
+      </w:rPr>
+    </w:lvl>
+    <w:lvl w:ilvl="8">
+      <w:start w:val="1"/>
+      <w:numFmt w:val="bullet"/>
+      <w:lvlText w:val="■"/>
+      <w:lvlJc w:val="left"/>
+      <w:pPr>
+        <w:ind w:left="6480" w:hanging="360"/>
+      </w:pPr>
+      <w:rPr>
+        <w:u w:val="none"/>
+      </w:rPr>
+    </w:lvl>
+  </w:abstractNum>
   <w:num w:numId="1">
     <w:abstractNumId w:val="1"/>
   </w:num>
   <w:num w:numId="2">
     <w:abstractNumId w:val="2"/>
+  </w:num>
+  <w:num w:numId="3">
+    <w:abstractNumId w:val="3"/>
   </w:num>
 </w:numbering>
 </file>

</xml_diff>